<commit_message>
Versión ROOT del modo avión - necesario cambiar
</commit_message>
<xml_diff>
--- a/doc/Proyecto practicas DAM.docx
+++ b/doc/Proyecto practicas DAM.docx
@@ -545,59 +545,12 @@
           <w:bCs/>
         </w:rPr>
       </w:pPr>
-    </w:p>
-    <w:p>
-      <w:pPr>
-        <w:rPr>
-          <w:b/>
-          <w:bCs/>
-        </w:rPr>
-      </w:pPr>
-    </w:p>
-    <w:p>
-      <w:pPr>
-        <w:rPr>
-          <w:b/>
-          <w:bCs/>
-        </w:rPr>
-      </w:pPr>
-    </w:p>
-    <w:p>
-      <w:pPr>
-        <w:rPr>
-          <w:b/>
-          <w:bCs/>
-        </w:rPr>
-      </w:pPr>
-    </w:p>
-    <w:p>
-      <w:pPr>
-        <w:rPr>
-          <w:b/>
-          <w:bCs/>
-        </w:rPr>
-      </w:pPr>
-    </w:p>
-    <w:p>
-      <w:pPr>
-        <w:rPr>
-          <w:b/>
-          <w:bCs/>
-        </w:rPr>
-      </w:pPr>
-    </w:p>
-    <w:p>
-      <w:pPr>
-        <w:rPr>
-          <w:b/>
-          <w:bCs/>
-        </w:rPr>
-      </w:pPr>
-      <w:r>
-        <w:rPr>
-          <w:b/>
-          <w:bCs/>
-        </w:rPr>
+      <w:r>
+        <w:rPr>
+          <w:b/>
+          <w:bCs/>
+        </w:rPr>
+        <w:lastRenderedPageBreak/>
         <w:t>BLOQUE 2: Comunicación con Hardware y Multidispositivo</w:t>
       </w:r>
     </w:p>
@@ -1010,65 +963,65 @@
           <w:b/>
           <w:bCs/>
         </w:rPr>
+        <w:t>MP0488 (Interfaces):</w:t>
+      </w:r>
+      <w:r>
+        <w:t xml:space="preserve"> RA3 y RA4. Diseño de menús y componentes personalizados de control.</w:t>
+      </w:r>
+    </w:p>
+    <w:p>
+      <w:pPr>
+        <w:rPr>
+          <w:b/>
+          <w:bCs/>
+        </w:rPr>
+      </w:pPr>
+    </w:p>
+    <w:p>
+      <w:pPr>
+        <w:rPr>
+          <w:b/>
+          <w:bCs/>
+        </w:rPr>
+      </w:pPr>
+    </w:p>
+    <w:p>
+      <w:pPr>
+        <w:rPr>
+          <w:b/>
+          <w:bCs/>
+        </w:rPr>
+      </w:pPr>
+    </w:p>
+    <w:p>
+      <w:pPr>
+        <w:rPr>
+          <w:b/>
+          <w:bCs/>
+        </w:rPr>
+      </w:pPr>
+    </w:p>
+    <w:p>
+      <w:pPr>
+        <w:rPr>
+          <w:b/>
+          <w:bCs/>
+        </w:rPr>
+      </w:pPr>
+    </w:p>
+    <w:p>
+      <w:pPr>
+        <w:rPr>
+          <w:b/>
+          <w:bCs/>
+        </w:rPr>
+      </w:pPr>
+      <w:r>
+        <w:rPr>
+          <w:b/>
+          <w:bCs/>
+        </w:rPr>
         <w:lastRenderedPageBreak/>
-        <w:t>MP0488 (Interfaces):</w:t>
-      </w:r>
-      <w:r>
-        <w:t xml:space="preserve"> RA3 y RA4. Diseño de menús y componentes personalizados de control.</w:t>
-      </w:r>
-    </w:p>
-    <w:p>
-      <w:pPr>
-        <w:rPr>
-          <w:b/>
-          <w:bCs/>
-        </w:rPr>
-      </w:pPr>
-    </w:p>
-    <w:p>
-      <w:pPr>
-        <w:rPr>
-          <w:b/>
-          <w:bCs/>
-        </w:rPr>
-      </w:pPr>
-    </w:p>
-    <w:p>
-      <w:pPr>
-        <w:rPr>
-          <w:b/>
-          <w:bCs/>
-        </w:rPr>
-      </w:pPr>
-    </w:p>
-    <w:p>
-      <w:pPr>
-        <w:rPr>
-          <w:b/>
-          <w:bCs/>
-        </w:rPr>
-      </w:pPr>
-    </w:p>
-    <w:p>
-      <w:pPr>
-        <w:rPr>
-          <w:b/>
-          <w:bCs/>
-        </w:rPr>
-      </w:pPr>
-    </w:p>
-    <w:p>
-      <w:pPr>
-        <w:rPr>
-          <w:b/>
-          <w:bCs/>
-        </w:rPr>
-      </w:pPr>
-      <w:r>
-        <w:rPr>
-          <w:b/>
-          <w:bCs/>
-        </w:rPr>
         <w:t xml:space="preserve">BLOQUE 4: Módulo de </w:t>
       </w:r>
       <w:proofErr w:type="spellStart"/>
@@ -1558,6 +1511,7 @@
           <w:b/>
           <w:bCs/>
         </w:rPr>
+        <w:lastRenderedPageBreak/>
         <w:t>BLOQUE 6: Seguridad, Extracción y Logs</w:t>
       </w:r>
     </w:p>
@@ -2184,7 +2138,6 @@
           <w:b/>
           <w:bCs/>
         </w:rPr>
-        <w:lastRenderedPageBreak/>
         <w:t>Base de Datos:</w:t>
       </w:r>
       <w:r>

</xml_diff>

<commit_message>
cambios al documento de la app
</commit_message>
<xml_diff>
--- a/doc/Proyecto practicas DAM.docx
+++ b/doc/Proyecto practicas DAM.docx
@@ -969,59 +969,59 @@
         <w:t xml:space="preserve"> RA3 y RA4. Diseño de menús y componentes personalizados de control.</w:t>
       </w:r>
     </w:p>
-    <w:p>
-      <w:pPr>
-        <w:rPr>
-          <w:b/>
-          <w:bCs/>
-        </w:rPr>
-      </w:pPr>
-    </w:p>
-    <w:p>
-      <w:pPr>
-        <w:rPr>
-          <w:b/>
-          <w:bCs/>
-        </w:rPr>
-      </w:pPr>
-    </w:p>
-    <w:p>
-      <w:pPr>
-        <w:rPr>
-          <w:b/>
-          <w:bCs/>
-        </w:rPr>
-      </w:pPr>
-    </w:p>
-    <w:p>
-      <w:pPr>
-        <w:rPr>
-          <w:b/>
-          <w:bCs/>
-        </w:rPr>
-      </w:pPr>
-    </w:p>
-    <w:p>
-      <w:pPr>
-        <w:rPr>
-          <w:b/>
-          <w:bCs/>
-        </w:rPr>
-      </w:pPr>
-    </w:p>
-    <w:p>
-      <w:pPr>
-        <w:rPr>
-          <w:b/>
-          <w:bCs/>
-        </w:rPr>
-      </w:pPr>
-      <w:r>
-        <w:rPr>
-          <w:b/>
-          <w:bCs/>
-        </w:rPr>
-        <w:lastRenderedPageBreak/>
+    <w:p/>
+    <w:p>
+      <w:pPr>
+        <w:rPr>
+          <w:b/>
+          <w:bCs/>
+        </w:rPr>
+      </w:pPr>
+    </w:p>
+    <w:p>
+      <w:pPr>
+        <w:rPr>
+          <w:b/>
+          <w:bCs/>
+        </w:rPr>
+      </w:pPr>
+    </w:p>
+    <w:p>
+      <w:pPr>
+        <w:rPr>
+          <w:b/>
+          <w:bCs/>
+        </w:rPr>
+      </w:pPr>
+    </w:p>
+    <w:p>
+      <w:pPr>
+        <w:rPr>
+          <w:b/>
+          <w:bCs/>
+        </w:rPr>
+      </w:pPr>
+    </w:p>
+    <w:p>
+      <w:pPr>
+        <w:rPr>
+          <w:b/>
+          <w:bCs/>
+        </w:rPr>
+      </w:pPr>
+    </w:p>
+    <w:p>
+      <w:pPr>
+        <w:rPr>
+          <w:b/>
+          <w:bCs/>
+        </w:rPr>
+      </w:pPr>
+      <w:r>
+        <w:rPr>
+          <w:b/>
+          <w:bCs/>
+        </w:rPr>
         <w:t xml:space="preserve">BLOQUE 4: Módulo de </w:t>
       </w:r>
       <w:proofErr w:type="spellStart"/>
@@ -1126,15 +1126,7 @@
       </w:r>
       <w:proofErr w:type="spellEnd"/>
       <w:r>
-        <w:t xml:space="preserve"> </w:t>
-      </w:r>
-      <w:proofErr w:type="spellStart"/>
-      <w:r>
-        <w:t>to</w:t>
-      </w:r>
-      <w:proofErr w:type="spellEnd"/>
-      <w:r>
-        <w:t xml:space="preserve"> SSID, 3. Ping 8.8.8.8, 4. Off </w:t>
+        <w:t xml:space="preserve"> to SSID, 3. Ping 8.8.8.8, 4. Off </w:t>
       </w:r>
       <w:proofErr w:type="spellStart"/>
       <w:r>
@@ -1306,7 +1298,25 @@
           <w:bCs/>
           <w:color w:val="4472C4" w:themeColor="accent1"/>
         </w:rPr>
-        <w:t xml:space="preserve"> que tenia todos los métodos que eran necesarios para hacer las pruebas automatizadas los cuales recibían como parámetros el nombre del paso y el comando para que este funcionase, además en el caso del método de </w:t>
+        <w:t xml:space="preserve"> que </w:t>
+      </w:r>
+      <w:proofErr w:type="spellStart"/>
+      <w:r>
+        <w:rPr>
+          <w:b/>
+          <w:bCs/>
+          <w:color w:val="4472C4" w:themeColor="accent1"/>
+        </w:rPr>
+        <w:t>tenia</w:t>
+      </w:r>
+      <w:proofErr w:type="spellEnd"/>
+      <w:r>
+        <w:rPr>
+          <w:b/>
+          <w:bCs/>
+          <w:color w:val="4472C4" w:themeColor="accent1"/>
+        </w:rPr>
+        <w:t xml:space="preserve"> todos los métodos que eran necesarios para hacer las pruebas automatizadas los cuales recibían como parámetros el nombre del paso y el comando para que este funcionase, además en el caso del método de </w:t>
       </w:r>
       <w:proofErr w:type="spellStart"/>
       <w:r>
@@ -1673,6 +1683,7 @@
           <w:b/>
           <w:bCs/>
         </w:rPr>
+        <w:lastRenderedPageBreak/>
         <w:t>Referencia Evaluación (PDF Xunta):</w:t>
       </w:r>
     </w:p>
@@ -1691,7 +1702,6 @@
           <w:bCs/>
           <w:color w:val="4472C4" w:themeColor="accent1"/>
         </w:rPr>
-        <w:lastRenderedPageBreak/>
         <w:t xml:space="preserve">Para este bloque se creó la clase </w:t>
       </w:r>
       <w:proofErr w:type="spellStart"/>
@@ -2267,6 +2277,7 @@
           <w:b/>
           <w:bCs/>
         </w:rPr>
+        <w:lastRenderedPageBreak/>
         <w:t>Paquetes:</w:t>
       </w:r>
       <w:r>
@@ -2330,7 +2341,6 @@
           <w:b/>
           <w:bCs/>
         </w:rPr>
-        <w:lastRenderedPageBreak/>
         <w:t>Red:</w:t>
       </w:r>
       <w:r>
@@ -4404,6 +4414,7 @@
   <w:style w:type="character" w:default="1" w:styleId="Fuentedeprrafopredeter">
     <w:name w:val="Default Paragraph Font"/>
     <w:uiPriority w:val="1"/>
+    <w:semiHidden/>
     <w:unhideWhenUsed/>
   </w:style>
   <w:style w:type="table" w:default="1" w:styleId="Tablanormal">

</xml_diff>

<commit_message>
documento de los bloques subido
</commit_message>
<xml_diff>
--- a/doc/Proyecto practicas DAM.docx
+++ b/doc/Proyecto practicas DAM.docx
@@ -969,38 +969,523 @@
         <w:t xml:space="preserve"> RA3 y RA4. Diseño de menús y componentes personalizados de control.</w:t>
       </w:r>
     </w:p>
-    <w:p/>
-    <w:p>
-      <w:pPr>
-        <w:rPr>
-          <w:b/>
-          <w:bCs/>
-        </w:rPr>
-      </w:pPr>
-    </w:p>
-    <w:p>
-      <w:pPr>
-        <w:rPr>
-          <w:b/>
-          <w:bCs/>
-        </w:rPr>
-      </w:pPr>
-    </w:p>
-    <w:p>
-      <w:pPr>
-        <w:rPr>
-          <w:b/>
-          <w:bCs/>
-        </w:rPr>
-      </w:pPr>
-    </w:p>
-    <w:p>
-      <w:pPr>
-        <w:rPr>
-          <w:b/>
-          <w:bCs/>
-        </w:rPr>
-      </w:pPr>
+    <w:p>
+      <w:pPr>
+        <w:rPr>
+          <w:color w:val="4472C4" w:themeColor="accent1"/>
+        </w:rPr>
+      </w:pPr>
+      <w:r>
+        <w:rPr>
+          <w:b/>
+          <w:bCs/>
+          <w:color w:val="4472C4" w:themeColor="accent1"/>
+        </w:rPr>
+        <w:t xml:space="preserve">Para el ADB Wifi se creó la clase </w:t>
+      </w:r>
+      <w:proofErr w:type="spellStart"/>
+      <w:r>
+        <w:rPr>
+          <w:b/>
+          <w:bCs/>
+          <w:color w:val="4472C4" w:themeColor="accent1"/>
+        </w:rPr>
+        <w:t>ADBWifiController</w:t>
+      </w:r>
+      <w:proofErr w:type="spellEnd"/>
+      <w:r>
+        <w:rPr>
+          <w:b/>
+          <w:bCs/>
+          <w:color w:val="4472C4" w:themeColor="accent1"/>
+        </w:rPr>
+        <w:t xml:space="preserve"> quien es el controlador del archivo </w:t>
+      </w:r>
+      <w:proofErr w:type="spellStart"/>
+      <w:r>
+        <w:rPr>
+          <w:b/>
+          <w:bCs/>
+          <w:color w:val="4472C4" w:themeColor="accent1"/>
+        </w:rPr>
+        <w:t>pane_adb_</w:t>
+      </w:r>
+      <w:proofErr w:type="gramStart"/>
+      <w:r>
+        <w:rPr>
+          <w:b/>
+          <w:bCs/>
+          <w:color w:val="4472C4" w:themeColor="accent1"/>
+        </w:rPr>
+        <w:t>wifi.</w:t>
+      </w:r>
+      <w:r>
+        <w:rPr>
+          <w:color w:val="4472C4" w:themeColor="accent1"/>
+        </w:rPr>
+        <w:t>fxml</w:t>
+      </w:r>
+      <w:proofErr w:type="spellEnd"/>
+      <w:proofErr w:type="gramEnd"/>
+      <w:r>
+        <w:rPr>
+          <w:color w:val="4472C4" w:themeColor="accent1"/>
+        </w:rPr>
+        <w:t xml:space="preserve"> </w:t>
+      </w:r>
+      <w:r>
+        <w:rPr>
+          <w:color w:val="4472C4" w:themeColor="accent1"/>
+        </w:rPr>
+        <w:t xml:space="preserve"> y hace estas 3 coas </w:t>
+      </w:r>
+      <w:proofErr w:type="spellStart"/>
+      <w:proofErr w:type="gramStart"/>
+      <w:r>
+        <w:rPr>
+          <w:color w:val="4472C4" w:themeColor="accent1"/>
+        </w:rPr>
+        <w:t>principales.</w:t>
+      </w:r>
+      <w:r>
+        <w:rPr>
+          <w:b/>
+          <w:bCs/>
+          <w:color w:val="4472C4" w:themeColor="accent1"/>
+        </w:rPr>
+        <w:t>Al</w:t>
+      </w:r>
+      <w:proofErr w:type="spellEnd"/>
+      <w:proofErr w:type="gramEnd"/>
+      <w:r>
+        <w:rPr>
+          <w:b/>
+          <w:bCs/>
+          <w:color w:val="4472C4" w:themeColor="accent1"/>
+        </w:rPr>
+        <w:t xml:space="preserve"> abrirse</w:t>
+      </w:r>
+      <w:r>
+        <w:rPr>
+          <w:color w:val="4472C4" w:themeColor="accent1"/>
+        </w:rPr>
+        <w:t xml:space="preserve"> — </w:t>
+      </w:r>
+      <w:proofErr w:type="spellStart"/>
+      <w:proofErr w:type="gramStart"/>
+      <w:r>
+        <w:rPr>
+          <w:color w:val="4472C4" w:themeColor="accent1"/>
+        </w:rPr>
+        <w:t>setSerial</w:t>
+      </w:r>
+      <w:proofErr w:type="spellEnd"/>
+      <w:r>
+        <w:rPr>
+          <w:color w:val="4472C4" w:themeColor="accent1"/>
+        </w:rPr>
+        <w:t>(</w:t>
+      </w:r>
+      <w:proofErr w:type="gramEnd"/>
+      <w:r>
+        <w:rPr>
+          <w:color w:val="4472C4" w:themeColor="accent1"/>
+        </w:rPr>
+        <w:t xml:space="preserve">) recibe el identificador del dispositivo y llama a </w:t>
+      </w:r>
+      <w:proofErr w:type="spellStart"/>
+      <w:proofErr w:type="gramStart"/>
+      <w:r>
+        <w:rPr>
+          <w:color w:val="4472C4" w:themeColor="accent1"/>
+        </w:rPr>
+        <w:t>actualizarEstadoInicial</w:t>
+      </w:r>
+      <w:proofErr w:type="spellEnd"/>
+      <w:r>
+        <w:rPr>
+          <w:color w:val="4472C4" w:themeColor="accent1"/>
+        </w:rPr>
+        <w:t>(</w:t>
+      </w:r>
+      <w:proofErr w:type="gramEnd"/>
+      <w:r>
+        <w:rPr>
+          <w:color w:val="4472C4" w:themeColor="accent1"/>
+        </w:rPr>
+        <w:t xml:space="preserve">) que consulta </w:t>
+      </w:r>
+      <w:proofErr w:type="spellStart"/>
+      <w:r>
+        <w:rPr>
+          <w:color w:val="4472C4" w:themeColor="accent1"/>
+        </w:rPr>
+        <w:t>via</w:t>
+      </w:r>
+      <w:proofErr w:type="spellEnd"/>
+      <w:r>
+        <w:rPr>
+          <w:color w:val="4472C4" w:themeColor="accent1"/>
+        </w:rPr>
+        <w:t xml:space="preserve"> ADB qué interfaces de red tiene activas el móvil (</w:t>
+      </w:r>
+      <w:proofErr w:type="spellStart"/>
+      <w:r>
+        <w:rPr>
+          <w:color w:val="4472C4" w:themeColor="accent1"/>
+        </w:rPr>
+        <w:t>ip</w:t>
+      </w:r>
+      <w:proofErr w:type="spellEnd"/>
+      <w:r>
+        <w:rPr>
+          <w:color w:val="4472C4" w:themeColor="accent1"/>
+        </w:rPr>
+        <w:t xml:space="preserve"> </w:t>
+      </w:r>
+      <w:proofErr w:type="spellStart"/>
+      <w:r>
+        <w:rPr>
+          <w:color w:val="4472C4" w:themeColor="accent1"/>
+        </w:rPr>
+        <w:t>addr</w:t>
+      </w:r>
+      <w:proofErr w:type="spellEnd"/>
+      <w:r>
+        <w:rPr>
+          <w:color w:val="4472C4" w:themeColor="accent1"/>
+        </w:rPr>
+        <w:t xml:space="preserve"> show) y actualiza el </w:t>
+      </w:r>
+      <w:proofErr w:type="spellStart"/>
+      <w:r>
+        <w:rPr>
+          <w:color w:val="4472C4" w:themeColor="accent1"/>
+        </w:rPr>
+        <w:t>label</w:t>
+      </w:r>
+      <w:proofErr w:type="spellEnd"/>
+      <w:r>
+        <w:rPr>
+          <w:color w:val="4472C4" w:themeColor="accent1"/>
+        </w:rPr>
+        <w:t xml:space="preserve"> de estado con un color según lo que encuentre: verde si hay </w:t>
+      </w:r>
+      <w:proofErr w:type="spellStart"/>
+      <w:r>
+        <w:rPr>
+          <w:color w:val="4472C4" w:themeColor="accent1"/>
+        </w:rPr>
+        <w:t>WiFi</w:t>
+      </w:r>
+      <w:proofErr w:type="spellEnd"/>
+      <w:r>
+        <w:rPr>
+          <w:color w:val="4472C4" w:themeColor="accent1"/>
+        </w:rPr>
+        <w:t xml:space="preserve">, azul si hay USB </w:t>
+      </w:r>
+      <w:proofErr w:type="spellStart"/>
+      <w:r>
+        <w:rPr>
+          <w:color w:val="4472C4" w:themeColor="accent1"/>
+        </w:rPr>
+        <w:t>Tethering</w:t>
+      </w:r>
+      <w:proofErr w:type="spellEnd"/>
+      <w:r>
+        <w:rPr>
+          <w:color w:val="4472C4" w:themeColor="accent1"/>
+        </w:rPr>
+        <w:t>, gris si solo hay cable ADB.</w:t>
+      </w:r>
+    </w:p>
+    <w:p>
+      <w:pPr>
+        <w:rPr>
+          <w:color w:val="4472C4" w:themeColor="accent1"/>
+        </w:rPr>
+      </w:pPr>
+      <w:r>
+        <w:rPr>
+          <w:b/>
+          <w:bCs/>
+          <w:color w:val="4472C4" w:themeColor="accent1"/>
+        </w:rPr>
+        <w:lastRenderedPageBreak/>
+        <w:t xml:space="preserve">Botón "Conectar por </w:t>
+      </w:r>
+      <w:proofErr w:type="spellStart"/>
+      <w:r>
+        <w:rPr>
+          <w:b/>
+          <w:bCs/>
+          <w:color w:val="4472C4" w:themeColor="accent1"/>
+        </w:rPr>
+        <w:t>WiFi</w:t>
+      </w:r>
+      <w:proofErr w:type="spellEnd"/>
+      <w:r>
+        <w:rPr>
+          <w:b/>
+          <w:bCs/>
+          <w:color w:val="4472C4" w:themeColor="accent1"/>
+        </w:rPr>
+        <w:t>"</w:t>
+      </w:r>
+      <w:r>
+        <w:rPr>
+          <w:color w:val="4472C4" w:themeColor="accent1"/>
+        </w:rPr>
+        <w:t xml:space="preserve"> — </w:t>
+      </w:r>
+      <w:proofErr w:type="spellStart"/>
+      <w:proofErr w:type="gramStart"/>
+      <w:r>
+        <w:rPr>
+          <w:color w:val="4472C4" w:themeColor="accent1"/>
+        </w:rPr>
+        <w:t>conectarAdbWifi</w:t>
+      </w:r>
+      <w:proofErr w:type="spellEnd"/>
+      <w:r>
+        <w:rPr>
+          <w:color w:val="4472C4" w:themeColor="accent1"/>
+        </w:rPr>
+        <w:t>(</w:t>
+      </w:r>
+      <w:proofErr w:type="gramEnd"/>
+      <w:r>
+        <w:rPr>
+          <w:color w:val="4472C4" w:themeColor="accent1"/>
+        </w:rPr>
+        <w:t xml:space="preserve">) hace el proceso completo de conexión inalámbrica: activa el </w:t>
+      </w:r>
+      <w:proofErr w:type="spellStart"/>
+      <w:r>
+        <w:rPr>
+          <w:color w:val="4472C4" w:themeColor="accent1"/>
+        </w:rPr>
+        <w:t>daemon</w:t>
+      </w:r>
+      <w:proofErr w:type="spellEnd"/>
+      <w:r>
+        <w:rPr>
+          <w:color w:val="4472C4" w:themeColor="accent1"/>
+        </w:rPr>
+        <w:t xml:space="preserve"> TCP en el puerto 5555 con </w:t>
+      </w:r>
+      <w:proofErr w:type="spellStart"/>
+      <w:r>
+        <w:rPr>
+          <w:color w:val="4472C4" w:themeColor="accent1"/>
+        </w:rPr>
+        <w:t>adb</w:t>
+      </w:r>
+      <w:proofErr w:type="spellEnd"/>
+      <w:r>
+        <w:rPr>
+          <w:color w:val="4472C4" w:themeColor="accent1"/>
+        </w:rPr>
+        <w:t xml:space="preserve"> </w:t>
+      </w:r>
+      <w:proofErr w:type="spellStart"/>
+      <w:r>
+        <w:rPr>
+          <w:color w:val="4472C4" w:themeColor="accent1"/>
+        </w:rPr>
+        <w:t>tcpip</w:t>
+      </w:r>
+      <w:proofErr w:type="spellEnd"/>
+      <w:r>
+        <w:rPr>
+          <w:color w:val="4472C4" w:themeColor="accent1"/>
+        </w:rPr>
+        <w:t xml:space="preserve"> 5555, espera 2 segundos, detecta la IP actual del móvil en la red </w:t>
+      </w:r>
+      <w:proofErr w:type="spellStart"/>
+      <w:r>
+        <w:rPr>
+          <w:color w:val="4472C4" w:themeColor="accent1"/>
+        </w:rPr>
+        <w:t>WiFi</w:t>
+      </w:r>
+      <w:proofErr w:type="spellEnd"/>
+      <w:r>
+        <w:rPr>
+          <w:color w:val="4472C4" w:themeColor="accent1"/>
+        </w:rPr>
+        <w:t xml:space="preserve"> leyendo </w:t>
+      </w:r>
+      <w:proofErr w:type="spellStart"/>
+      <w:r>
+        <w:rPr>
+          <w:color w:val="4472C4" w:themeColor="accent1"/>
+        </w:rPr>
+        <w:t>ip</w:t>
+      </w:r>
+      <w:proofErr w:type="spellEnd"/>
+      <w:r>
+        <w:rPr>
+          <w:color w:val="4472C4" w:themeColor="accent1"/>
+        </w:rPr>
+        <w:t xml:space="preserve"> </w:t>
+      </w:r>
+      <w:proofErr w:type="spellStart"/>
+      <w:r>
+        <w:rPr>
+          <w:color w:val="4472C4" w:themeColor="accent1"/>
+        </w:rPr>
+        <w:t>route</w:t>
+      </w:r>
+      <w:proofErr w:type="spellEnd"/>
+      <w:r>
+        <w:rPr>
+          <w:color w:val="4472C4" w:themeColor="accent1"/>
+        </w:rPr>
+        <w:t xml:space="preserve"> y filtrando la línea de wlan0, y finalmente ejecuta </w:t>
+      </w:r>
+      <w:proofErr w:type="spellStart"/>
+      <w:r>
+        <w:rPr>
+          <w:color w:val="4472C4" w:themeColor="accent1"/>
+        </w:rPr>
+        <w:t>adb</w:t>
+      </w:r>
+      <w:proofErr w:type="spellEnd"/>
+      <w:r>
+        <w:rPr>
+          <w:color w:val="4472C4" w:themeColor="accent1"/>
+        </w:rPr>
+        <w:t xml:space="preserve"> </w:t>
+      </w:r>
+      <w:proofErr w:type="spellStart"/>
+      <w:r>
+        <w:rPr>
+          <w:color w:val="4472C4" w:themeColor="accent1"/>
+        </w:rPr>
+        <w:t>connect</w:t>
+      </w:r>
+      <w:proofErr w:type="spellEnd"/>
+      <w:r>
+        <w:rPr>
+          <w:color w:val="4472C4" w:themeColor="accent1"/>
+        </w:rPr>
+        <w:t xml:space="preserve"> IP:5555. Si conecta bien pone el </w:t>
+      </w:r>
+      <w:proofErr w:type="spellStart"/>
+      <w:r>
+        <w:rPr>
+          <w:color w:val="4472C4" w:themeColor="accent1"/>
+        </w:rPr>
+        <w:t>label</w:t>
+      </w:r>
+      <w:proofErr w:type="spellEnd"/>
+      <w:r>
+        <w:rPr>
+          <w:color w:val="4472C4" w:themeColor="accent1"/>
+        </w:rPr>
+        <w:t xml:space="preserve"> en verde con la IP, si falla lo pone en rojo con el error.</w:t>
+      </w:r>
+    </w:p>
+    <w:p>
+      <w:pPr>
+        <w:rPr>
+          <w:color w:val="4472C4" w:themeColor="accent1"/>
+        </w:rPr>
+      </w:pPr>
+      <w:r>
+        <w:rPr>
+          <w:b/>
+          <w:bCs/>
+          <w:color w:val="4472C4" w:themeColor="accent1"/>
+        </w:rPr>
+        <w:t>Botón "Conectar por USB"</w:t>
+      </w:r>
+      <w:r>
+        <w:rPr>
+          <w:color w:val="4472C4" w:themeColor="accent1"/>
+        </w:rPr>
+        <w:t xml:space="preserve"> — </w:t>
+      </w:r>
+      <w:proofErr w:type="spellStart"/>
+      <w:proofErr w:type="gramStart"/>
+      <w:r>
+        <w:rPr>
+          <w:color w:val="4472C4" w:themeColor="accent1"/>
+        </w:rPr>
+        <w:t>conectarAdbUsb</w:t>
+      </w:r>
+      <w:proofErr w:type="spellEnd"/>
+      <w:r>
+        <w:rPr>
+          <w:color w:val="4472C4" w:themeColor="accent1"/>
+        </w:rPr>
+        <w:t>(</w:t>
+      </w:r>
+      <w:proofErr w:type="gramEnd"/>
+      <w:r>
+        <w:rPr>
+          <w:color w:val="4472C4" w:themeColor="accent1"/>
+        </w:rPr>
+        <w:t xml:space="preserve">) primero detecta la IP actual (por si cambió desde la última conexión) y luego ejecuta </w:t>
+      </w:r>
+      <w:proofErr w:type="spellStart"/>
+      <w:r>
+        <w:rPr>
+          <w:color w:val="4472C4" w:themeColor="accent1"/>
+        </w:rPr>
+        <w:t>adb</w:t>
+      </w:r>
+      <w:proofErr w:type="spellEnd"/>
+      <w:r>
+        <w:rPr>
+          <w:color w:val="4472C4" w:themeColor="accent1"/>
+        </w:rPr>
+        <w:t xml:space="preserve"> </w:t>
+      </w:r>
+      <w:proofErr w:type="spellStart"/>
+      <w:r>
+        <w:rPr>
+          <w:color w:val="4472C4" w:themeColor="accent1"/>
+        </w:rPr>
+        <w:t>disconnect</w:t>
+      </w:r>
+      <w:proofErr w:type="spellEnd"/>
+      <w:r>
+        <w:rPr>
+          <w:color w:val="4472C4" w:themeColor="accent1"/>
+        </w:rPr>
+        <w:t xml:space="preserve"> IP:5555 para cerrar la sesión </w:t>
+      </w:r>
+      <w:proofErr w:type="spellStart"/>
+      <w:r>
+        <w:rPr>
+          <w:color w:val="4472C4" w:themeColor="accent1"/>
+        </w:rPr>
+        <w:t>WiFi</w:t>
+      </w:r>
+      <w:proofErr w:type="spellEnd"/>
+      <w:r>
+        <w:rPr>
+          <w:color w:val="4472C4" w:themeColor="accent1"/>
+        </w:rPr>
+        <w:t xml:space="preserve"> y volver al modo cable. Actualiza el </w:t>
+      </w:r>
+      <w:proofErr w:type="spellStart"/>
+      <w:r>
+        <w:rPr>
+          <w:color w:val="4472C4" w:themeColor="accent1"/>
+        </w:rPr>
+        <w:t>label</w:t>
+      </w:r>
+      <w:proofErr w:type="spellEnd"/>
+      <w:r>
+        <w:rPr>
+          <w:color w:val="4472C4" w:themeColor="accent1"/>
+        </w:rPr>
+        <w:t xml:space="preserve"> a azul.</w:t>
+      </w:r>
     </w:p>
     <w:p>
       <w:pPr>
@@ -1572,6 +2057,7 @@
           <w:b/>
           <w:bCs/>
         </w:rPr>
+        <w:lastRenderedPageBreak/>
         <w:t>Descripción:</w:t>
       </w:r>
       <w:r>
@@ -1683,7 +2169,6 @@
           <w:b/>
           <w:bCs/>
         </w:rPr>
-        <w:lastRenderedPageBreak/>
         <w:t>Referencia Evaluación (PDF Xunta):</w:t>
       </w:r>
     </w:p>
@@ -1807,6 +2292,42 @@
           <w:color w:val="4472C4" w:themeColor="accent1"/>
         </w:rPr>
         <w:t xml:space="preserve"> ya que sirve para medir la corriente instantánea que sale de la batería de un móvil y nos ofrece una gran precisión.</w:t>
+      </w:r>
+    </w:p>
+    <w:p>
+      <w:pPr>
+        <w:ind w:left="720"/>
+        <w:rPr>
+          <w:b/>
+          <w:bCs/>
+          <w:color w:val="4472C4" w:themeColor="accent1"/>
+        </w:rPr>
+      </w:pPr>
+      <w:r>
+        <w:rPr>
+          <w:b/>
+          <w:bCs/>
+          <w:color w:val="4472C4" w:themeColor="accent1"/>
+        </w:rPr>
+        <w:t xml:space="preserve">Para medir la corriente se usó una función la cual llama </w:t>
+      </w:r>
+      <w:proofErr w:type="spellStart"/>
+      <w:r>
+        <w:rPr>
+          <w:b/>
+          <w:bCs/>
+          <w:color w:val="4472C4" w:themeColor="accent1"/>
+        </w:rPr>
+        <w:t>ejecutarComandoADBShell</w:t>
+      </w:r>
+      <w:proofErr w:type="spellEnd"/>
+      <w:r>
+        <w:rPr>
+          <w:b/>
+          <w:bCs/>
+          <w:color w:val="4472C4" w:themeColor="accent1"/>
+        </w:rPr>
+        <w:t xml:space="preserve"> a la cual se le pasaba el comando para leer esta misma.</w:t>
       </w:r>
     </w:p>
     <w:p>
@@ -2094,6 +2615,7 @@
           <w:b/>
           <w:bCs/>
         </w:rPr>
+        <w:lastRenderedPageBreak/>
         <w:t>Capturas:</w:t>
       </w:r>
       <w:r>
@@ -2277,7 +2799,6 @@
           <w:b/>
           <w:bCs/>
         </w:rPr>
-        <w:lastRenderedPageBreak/>
         <w:t>Paquetes:</w:t>
       </w:r>
       <w:r>
@@ -4414,7 +4935,6 @@
   <w:style w:type="character" w:default="1" w:styleId="Fuentedeprrafopredeter">
     <w:name w:val="Default Paragraph Font"/>
     <w:uiPriority w:val="1"/>
-    <w:semiHidden/>
     <w:unhideWhenUsed/>
   </w:style>
   <w:style w:type="table" w:default="1" w:styleId="Tablanormal">

</xml_diff>